<commit_message>
- The possibility of advertising in the menu - New table in the d_promotion database - Checking for predictions for the user for the period - The ability to update data for the user
</commit_message>
<xml_diff>
--- a/bot/assets/pdf_templates/one_time_deep_seven_card_hand.docx
+++ b/bot/assets/pdf_templates/one_time_deep_seven_card_hand.docx
@@ -8,20 +8,16 @@
         <w:jc w:val="center"/>
         <w:rPr>
           <w:rFonts w:ascii="Georgia" w:hAnsi="Georgia"/>
+        </w:rPr>
+      </w:pPr>
+      <w:r>
+        <w:rPr>
+          <w:rFonts w:ascii="Georgia" w:hAnsi="Georgia"/>
           <w:b/>
           <w:bCs/>
           <w:sz w:val="48"/>
           <w:szCs w:val="48"/>
         </w:rPr>
-      </w:pPr>
-      <w:r>
-        <w:rPr>
-          <w:rFonts w:ascii="Georgia" w:hAnsi="Georgia"/>
-          <w:b/>
-          <w:bCs/>
-          <w:sz w:val="48"/>
-          <w:szCs w:val="48"/>
-        </w:rPr>
         <w:t>ГЛУБОКИЙ РАЗБОР СИТУАЦИИ</w:t>
       </w:r>
     </w:p>
@@ -30,12 +26,14 @@
         <w:pStyle w:val="Normal"/>
         <w:jc w:val="center"/>
         <w:rPr>
+          <w:rFonts w:ascii="Georgia" w:hAnsi="Georgia"/>
           <w:sz w:val="40"/>
           <w:szCs w:val="40"/>
         </w:rPr>
       </w:pPr>
       <w:r>
         <w:rPr>
+          <w:rFonts w:ascii="Georgia" w:hAnsi="Georgia"/>
           <w:sz w:val="40"/>
           <w:szCs w:val="40"/>
         </w:rPr>
@@ -46,13 +44,12 @@
         <w:pStyle w:val="Normal"/>
         <w:jc w:val="center"/>
         <w:rPr>
-          <w:sz w:val="36"/>
-          <w:szCs w:val="36"/>
-        </w:rPr>
-      </w:pPr>
-      <w:r>
-        <w:rPr>
-          <w:rFonts w:cs="Segoe UI Emoji" w:ascii="Segoe UI Emoji" w:hAnsi="Segoe UI Emoji"/>
+          <w:rFonts w:ascii="Georgia" w:hAnsi="Georgia"/>
+        </w:rPr>
+      </w:pPr>
+      <w:r>
+        <w:rPr>
+          <w:rFonts w:cs="Segoe UI Emoji" w:ascii="Georgia" w:hAnsi="Georgia"/>
           <w:b/>
           <w:bCs/>
           <w:sz w:val="36"/>
@@ -89,30 +86,18 @@
           <w:sz w:val="36"/>
           <w:szCs w:val="36"/>
         </w:rPr>
-        <w:t xml:space="preserve"> </w:t>
-      </w:r>
-      <w:r>
-        <w:rPr>
-          <w:rFonts w:cs="Segoe UI Emoji" w:ascii="Segoe UI Emoji" w:hAnsi="Segoe UI Emoji"/>
-          <w:b/>
-          <w:bCs/>
-          <w:sz w:val="36"/>
-          <w:szCs w:val="36"/>
-        </w:rPr>
-        <w:t>🌳</w:t>
-      </w:r>
-    </w:p>
-    <w:p>
-      <w:pPr>
-        <w:pStyle w:val="Normal"/>
-        <w:rPr>
-          <w:sz w:val="24"/>
-          <w:szCs w:val="24"/>
-        </w:rPr>
+        <w:t xml:space="preserve"> 🌳</w:t>
+      </w:r>
+    </w:p>
+    <w:p>
+      <w:pPr>
+        <w:pStyle w:val="Normal"/>
+        <w:rPr/>
       </w:pPr>
       <w:r>
         <w:rPr>
           <w:rStyle w:val="Style18"/>
+          <w:rFonts w:ascii="Georgia" w:hAnsi="Georgia"/>
           <w:color w:val="000000"/>
           <w:sz w:val="32"/>
           <w:szCs w:val="32"/>
@@ -122,7 +107,7 @@
       <w:r>
         <w:rPr>
           <w:rStyle w:val="Style19"/>
-          <w:rFonts w:ascii="Calibri" w:hAnsi="Calibri" w:asciiTheme="minorHAnsi" w:hAnsiTheme="minorHAnsi"/>
+          <w:rFonts w:ascii="Georgia" w:hAnsi="Georgia"/>
           <w:b/>
           <w:bCs/>
           <w:i/>
@@ -138,12 +123,14 @@
       <w:pPr>
         <w:pStyle w:val="Normal"/>
         <w:rPr>
+          <w:rFonts w:ascii="Georgia" w:hAnsi="Georgia"/>
           <w:sz w:val="24"/>
           <w:szCs w:val="24"/>
         </w:rPr>
       </w:pPr>
       <w:r>
         <w:rPr>
+          <w:rFonts w:ascii="Georgia" w:hAnsi="Georgia"/>
           <w:sz w:val="24"/>
           <w:szCs w:val="24"/>
         </w:rPr>
@@ -154,13 +141,12 @@
         <w:pStyle w:val="Normal"/>
         <w:jc w:val="center"/>
         <w:rPr>
-          <w:sz w:val="36"/>
-          <w:szCs w:val="36"/>
-        </w:rPr>
-      </w:pPr>
-      <w:r>
-        <w:rPr>
-          <w:rFonts w:cs="Segoe UI Emoji" w:ascii="Segoe UI Emoji" w:hAnsi="Segoe UI Emoji"/>
+          <w:rFonts w:ascii="Georgia" w:hAnsi="Georgia"/>
+        </w:rPr>
+      </w:pPr>
+      <w:r>
+        <w:rPr>
+          <w:rFonts w:cs="Segoe UI Emoji" w:ascii="Georgia" w:hAnsi="Georgia"/>
           <w:b/>
           <w:bCs/>
           <w:sz w:val="36"/>
@@ -197,30 +183,18 @@
           <w:sz w:val="36"/>
           <w:szCs w:val="36"/>
         </w:rPr>
-        <w:t xml:space="preserve"> </w:t>
-      </w:r>
-      <w:r>
-        <w:rPr>
-          <w:rFonts w:cs="Segoe UI Emoji" w:ascii="Segoe UI Emoji" w:hAnsi="Segoe UI Emoji"/>
-          <w:b/>
-          <w:bCs/>
-          <w:sz w:val="36"/>
-          <w:szCs w:val="36"/>
-        </w:rPr>
-        <w:t>🚧</w:t>
-      </w:r>
-    </w:p>
-    <w:p>
-      <w:pPr>
-        <w:pStyle w:val="Normal"/>
-        <w:rPr>
-          <w:sz w:val="24"/>
-          <w:szCs w:val="24"/>
-        </w:rPr>
+        <w:t xml:space="preserve"> 🚧</w:t>
+      </w:r>
+    </w:p>
+    <w:p>
+      <w:pPr>
+        <w:pStyle w:val="Normal"/>
+        <w:rPr/>
       </w:pPr>
       <w:r>
         <w:rPr>
           <w:rStyle w:val="Style18"/>
+          <w:rFonts w:ascii="Georgia" w:hAnsi="Georgia"/>
           <w:sz w:val="32"/>
           <w:szCs w:val="32"/>
         </w:rPr>
@@ -229,6 +203,7 @@
       <w:r>
         <w:rPr>
           <w:rStyle w:val="Style18"/>
+          <w:rFonts w:ascii="Georgia" w:hAnsi="Georgia"/>
           <w:b/>
           <w:bCs/>
         </w:rPr>
@@ -237,7 +212,7 @@
       <w:r>
         <w:rPr>
           <w:rStyle w:val="Style19"/>
-          <w:rFonts w:ascii="Calibri" w:hAnsi="Calibri" w:asciiTheme="minorHAnsi" w:hAnsiTheme="minorHAnsi"/>
+          <w:rFonts w:ascii="Georgia" w:hAnsi="Georgia"/>
           <w:b/>
           <w:bCs/>
           <w:i/>
@@ -253,12 +228,14 @@
       <w:pPr>
         <w:pStyle w:val="Normal"/>
         <w:rPr>
+          <w:rFonts w:ascii="Georgia" w:hAnsi="Georgia"/>
           <w:sz w:val="24"/>
           <w:szCs w:val="24"/>
         </w:rPr>
       </w:pPr>
       <w:r>
         <w:rPr>
+          <w:rFonts w:ascii="Georgia" w:hAnsi="Georgia"/>
           <w:sz w:val="24"/>
           <w:szCs w:val="24"/>
         </w:rPr>
@@ -269,13 +246,12 @@
         <w:pStyle w:val="Normal"/>
         <w:jc w:val="center"/>
         <w:rPr>
-          <w:sz w:val="36"/>
-          <w:szCs w:val="36"/>
-        </w:rPr>
-      </w:pPr>
-      <w:r>
-        <w:rPr>
-          <w:rFonts w:cs="Segoe UI Emoji" w:ascii="Segoe UI Emoji" w:hAnsi="Segoe UI Emoji"/>
+          <w:rFonts w:ascii="Georgia" w:hAnsi="Georgia"/>
+        </w:rPr>
+      </w:pPr>
+      <w:r>
+        <w:rPr>
+          <w:rFonts w:cs="Segoe UI Emoji" w:ascii="Georgia" w:hAnsi="Georgia"/>
           <w:b/>
           <w:bCs/>
           <w:sz w:val="36"/>
@@ -312,30 +288,18 @@
           <w:sz w:val="36"/>
           <w:szCs w:val="36"/>
         </w:rPr>
-        <w:t xml:space="preserve"> </w:t>
-      </w:r>
-      <w:r>
-        <w:rPr>
-          <w:rFonts w:cs="Segoe UI Emoji" w:ascii="Segoe UI Emoji" w:hAnsi="Segoe UI Emoji"/>
-          <w:b/>
-          <w:bCs/>
-          <w:sz w:val="36"/>
-          <w:szCs w:val="36"/>
-        </w:rPr>
-        <w:t>🧠</w:t>
-      </w:r>
-    </w:p>
-    <w:p>
-      <w:pPr>
-        <w:pStyle w:val="Normal"/>
-        <w:rPr>
-          <w:sz w:val="24"/>
-          <w:szCs w:val="24"/>
-        </w:rPr>
+        <w:t xml:space="preserve"> 🧠</w:t>
+      </w:r>
+    </w:p>
+    <w:p>
+      <w:pPr>
+        <w:pStyle w:val="Normal"/>
+        <w:rPr/>
       </w:pPr>
       <w:r>
         <w:rPr>
           <w:rStyle w:val="Style18"/>
+          <w:rFonts w:ascii="Georgia" w:hAnsi="Georgia"/>
           <w:sz w:val="32"/>
           <w:szCs w:val="32"/>
         </w:rPr>
@@ -344,7 +308,7 @@
       <w:r>
         <w:rPr>
           <w:rStyle w:val="Style19"/>
-          <w:rFonts w:ascii="Calibri" w:hAnsi="Calibri" w:asciiTheme="minorHAnsi" w:hAnsiTheme="minorHAnsi"/>
+          <w:rFonts w:ascii="Georgia" w:hAnsi="Georgia"/>
           <w:b/>
           <w:bCs/>
           <w:i/>
@@ -360,12 +324,14 @@
       <w:pPr>
         <w:pStyle w:val="Normal"/>
         <w:rPr>
+          <w:rFonts w:ascii="Georgia" w:hAnsi="Georgia"/>
           <w:sz w:val="24"/>
           <w:szCs w:val="24"/>
         </w:rPr>
       </w:pPr>
       <w:r>
         <w:rPr>
+          <w:rFonts w:ascii="Georgia" w:hAnsi="Georgia"/>
           <w:sz w:val="24"/>
           <w:szCs w:val="24"/>
         </w:rPr>
@@ -376,13 +342,12 @@
         <w:pStyle w:val="Normal"/>
         <w:jc w:val="center"/>
         <w:rPr>
-          <w:sz w:val="36"/>
-          <w:szCs w:val="36"/>
-        </w:rPr>
-      </w:pPr>
-      <w:r>
-        <w:rPr>
-          <w:rFonts w:cs="Segoe UI Emoji" w:ascii="Segoe UI Emoji" w:hAnsi="Segoe UI Emoji"/>
+          <w:rFonts w:ascii="Georgia" w:hAnsi="Georgia"/>
+        </w:rPr>
+      </w:pPr>
+      <w:r>
+        <w:rPr>
+          <w:rFonts w:cs="Segoe UI Emoji" w:ascii="Georgia" w:hAnsi="Georgia"/>
           <w:b/>
           <w:bCs/>
           <w:sz w:val="36"/>
@@ -419,30 +384,18 @@
           <w:sz w:val="36"/>
           <w:szCs w:val="36"/>
         </w:rPr>
-        <w:t xml:space="preserve"> </w:t>
-      </w:r>
-      <w:r>
-        <w:rPr>
-          <w:rFonts w:cs="Segoe UI Emoji" w:ascii="Segoe UI Emoji" w:hAnsi="Segoe UI Emoji"/>
-          <w:b/>
-          <w:bCs/>
-          <w:sz w:val="36"/>
-          <w:szCs w:val="36"/>
-        </w:rPr>
-        <w:t>🌍</w:t>
-      </w:r>
-    </w:p>
-    <w:p>
-      <w:pPr>
-        <w:pStyle w:val="Normal"/>
-        <w:rPr>
-          <w:sz w:val="24"/>
-          <w:szCs w:val="24"/>
-        </w:rPr>
+        <w:t xml:space="preserve"> 🌍</w:t>
+      </w:r>
+    </w:p>
+    <w:p>
+      <w:pPr>
+        <w:pStyle w:val="Normal"/>
+        <w:rPr/>
       </w:pPr>
       <w:r>
         <w:rPr>
           <w:rStyle w:val="Style18"/>
+          <w:rFonts w:ascii="Georgia" w:hAnsi="Georgia"/>
           <w:sz w:val="32"/>
           <w:szCs w:val="32"/>
         </w:rPr>
@@ -450,6 +403,7 @@
       </w:r>
       <w:r>
         <w:rPr>
+          <w:rFonts w:ascii="Georgia" w:hAnsi="Georgia"/>
           <w:sz w:val="28"/>
           <w:szCs w:val="28"/>
         </w:rPr>
@@ -458,7 +412,7 @@
       <w:r>
         <w:rPr>
           <w:rStyle w:val="Style19"/>
-          <w:rFonts w:ascii="Calibri" w:hAnsi="Calibri" w:asciiTheme="minorHAnsi" w:hAnsiTheme="minorHAnsi"/>
+          <w:rFonts w:ascii="Georgia" w:hAnsi="Georgia"/>
           <w:b/>
           <w:bCs/>
           <w:i/>
@@ -474,12 +428,14 @@
       <w:pPr>
         <w:pStyle w:val="Normal"/>
         <w:rPr>
+          <w:rFonts w:ascii="Georgia" w:hAnsi="Georgia"/>
           <w:sz w:val="24"/>
           <w:szCs w:val="24"/>
         </w:rPr>
       </w:pPr>
       <w:r>
         <w:rPr>
+          <w:rFonts w:ascii="Georgia" w:hAnsi="Georgia"/>
           <w:sz w:val="24"/>
           <w:szCs w:val="24"/>
         </w:rPr>
@@ -490,13 +446,12 @@
         <w:pStyle w:val="Normal"/>
         <w:jc w:val="center"/>
         <w:rPr>
-          <w:sz w:val="36"/>
-          <w:szCs w:val="36"/>
-        </w:rPr>
-      </w:pPr>
-      <w:r>
-        <w:rPr>
-          <w:rFonts w:cs="Segoe UI Emoji" w:ascii="Segoe UI Emoji" w:hAnsi="Segoe UI Emoji"/>
+          <w:rFonts w:ascii="Georgia" w:hAnsi="Georgia"/>
+        </w:rPr>
+      </w:pPr>
+      <w:r>
+        <w:rPr>
+          <w:rFonts w:cs="Segoe UI Emoji" w:ascii="Georgia" w:hAnsi="Georgia"/>
           <w:b/>
           <w:bCs/>
           <w:sz w:val="36"/>
@@ -533,30 +488,18 @@
           <w:sz w:val="36"/>
           <w:szCs w:val="36"/>
         </w:rPr>
-        <w:t xml:space="preserve"> </w:t>
-      </w:r>
-      <w:r>
-        <w:rPr>
-          <w:rFonts w:cs="Segoe UI Emoji" w:ascii="Segoe UI Emoji" w:hAnsi="Segoe UI Emoji"/>
-          <w:b/>
-          <w:bCs/>
-          <w:sz w:val="36"/>
-          <w:szCs w:val="36"/>
-        </w:rPr>
-        <w:t>🎯</w:t>
-      </w:r>
-    </w:p>
-    <w:p>
-      <w:pPr>
-        <w:pStyle w:val="Normal"/>
-        <w:rPr>
-          <w:sz w:val="24"/>
-          <w:szCs w:val="24"/>
-        </w:rPr>
+        <w:t xml:space="preserve"> 🎯</w:t>
+      </w:r>
+    </w:p>
+    <w:p>
+      <w:pPr>
+        <w:pStyle w:val="Normal"/>
+        <w:rPr/>
       </w:pPr>
       <w:r>
         <w:rPr>
           <w:rStyle w:val="Style18"/>
+          <w:rFonts w:ascii="Georgia" w:hAnsi="Georgia"/>
           <w:sz w:val="32"/>
           <w:szCs w:val="32"/>
         </w:rPr>
@@ -564,6 +507,7 @@
       </w:r>
       <w:r>
         <w:rPr>
+          <w:rFonts w:ascii="Georgia" w:hAnsi="Georgia"/>
           <w:sz w:val="28"/>
           <w:szCs w:val="28"/>
         </w:rPr>
@@ -572,7 +516,7 @@
       <w:r>
         <w:rPr>
           <w:rStyle w:val="Style19"/>
-          <w:rFonts w:ascii="Calibri" w:hAnsi="Calibri" w:asciiTheme="minorHAnsi" w:hAnsiTheme="minorHAnsi"/>
+          <w:rFonts w:ascii="Georgia" w:hAnsi="Georgia"/>
           <w:b/>
           <w:bCs/>
           <w:i/>
@@ -588,12 +532,14 @@
       <w:pPr>
         <w:pStyle w:val="Normal"/>
         <w:rPr>
+          <w:rFonts w:ascii="Georgia" w:hAnsi="Georgia"/>
           <w:sz w:val="24"/>
           <w:szCs w:val="24"/>
         </w:rPr>
       </w:pPr>
       <w:r>
         <w:rPr>
+          <w:rFonts w:ascii="Georgia" w:hAnsi="Georgia"/>
           <w:sz w:val="24"/>
           <w:szCs w:val="24"/>
         </w:rPr>
@@ -604,13 +550,12 @@
         <w:pStyle w:val="Normal"/>
         <w:jc w:val="center"/>
         <w:rPr>
-          <w:sz w:val="36"/>
-          <w:szCs w:val="36"/>
-        </w:rPr>
-      </w:pPr>
-      <w:r>
-        <w:rPr>
-          <w:rFonts w:cs="Segoe UI Emoji" w:ascii="Segoe UI Emoji" w:hAnsi="Segoe UI Emoji"/>
+          <w:rFonts w:ascii="Georgia" w:hAnsi="Georgia"/>
+        </w:rPr>
+      </w:pPr>
+      <w:r>
+        <w:rPr>
+          <w:rFonts w:cs="Segoe UI Emoji" w:ascii="Georgia" w:hAnsi="Georgia"/>
           <w:b/>
           <w:bCs/>
           <w:sz w:val="36"/>
@@ -647,30 +592,18 @@
           <w:sz w:val="36"/>
           <w:szCs w:val="36"/>
         </w:rPr>
-        <w:t xml:space="preserve"> </w:t>
-      </w:r>
-      <w:r>
-        <w:rPr>
-          <w:rFonts w:cs="Segoe UI Emoji" w:ascii="Segoe UI Emoji" w:hAnsi="Segoe UI Emoji"/>
-          <w:b/>
-          <w:bCs/>
-          <w:sz w:val="36"/>
-          <w:szCs w:val="36"/>
-        </w:rPr>
-        <w:t>🔮</w:t>
-      </w:r>
-    </w:p>
-    <w:p>
-      <w:pPr>
-        <w:pStyle w:val="Normal"/>
-        <w:rPr>
-          <w:sz w:val="24"/>
-          <w:szCs w:val="24"/>
-        </w:rPr>
+        <w:t xml:space="preserve"> 🔮</w:t>
+      </w:r>
+    </w:p>
+    <w:p>
+      <w:pPr>
+        <w:pStyle w:val="Normal"/>
+        <w:rPr/>
       </w:pPr>
       <w:r>
         <w:rPr>
           <w:rStyle w:val="Style18"/>
+          <w:rFonts w:ascii="Georgia" w:hAnsi="Georgia"/>
           <w:sz w:val="32"/>
           <w:szCs w:val="32"/>
         </w:rPr>
@@ -678,6 +611,7 @@
       </w:r>
       <w:r>
         <w:rPr>
+          <w:rFonts w:ascii="Georgia" w:hAnsi="Georgia"/>
           <w:b/>
           <w:bCs/>
           <w:i/>
@@ -691,7 +625,7 @@
       <w:r>
         <w:rPr>
           <w:rStyle w:val="Style19"/>
-          <w:rFonts w:ascii="Calibri" w:hAnsi="Calibri" w:asciiTheme="minorHAnsi" w:hAnsiTheme="minorHAnsi"/>
+          <w:rFonts w:ascii="Georgia" w:hAnsi="Georgia"/>
           <w:b/>
           <w:bCs/>
           <w:i/>
@@ -707,12 +641,14 @@
       <w:pPr>
         <w:pStyle w:val="Normal"/>
         <w:rPr>
+          <w:rFonts w:ascii="Georgia" w:hAnsi="Georgia"/>
           <w:sz w:val="24"/>
           <w:szCs w:val="24"/>
         </w:rPr>
       </w:pPr>
       <w:r>
         <w:rPr>
+          <w:rFonts w:ascii="Georgia" w:hAnsi="Georgia"/>
           <w:sz w:val="24"/>
           <w:szCs w:val="24"/>
         </w:rPr>
@@ -723,13 +659,12 @@
         <w:pStyle w:val="Normal"/>
         <w:jc w:val="center"/>
         <w:rPr>
-          <w:sz w:val="36"/>
-          <w:szCs w:val="36"/>
-        </w:rPr>
-      </w:pPr>
-      <w:r>
-        <w:rPr>
-          <w:rFonts w:cs="Segoe UI Emoji" w:ascii="Segoe UI Emoji" w:hAnsi="Segoe UI Emoji"/>
+          <w:rFonts w:ascii="Georgia" w:hAnsi="Georgia"/>
+        </w:rPr>
+      </w:pPr>
+      <w:r>
+        <w:rPr>
+          <w:rFonts w:cs="Segoe UI Emoji" w:ascii="Georgia" w:hAnsi="Georgia"/>
           <w:b/>
           <w:bCs/>
           <w:sz w:val="36"/>
@@ -766,30 +701,18 @@
           <w:sz w:val="36"/>
           <w:szCs w:val="36"/>
         </w:rPr>
-        <w:t xml:space="preserve"> </w:t>
-      </w:r>
-      <w:r>
-        <w:rPr>
-          <w:rFonts w:cs="Segoe UI Emoji" w:ascii="Segoe UI Emoji" w:hAnsi="Segoe UI Emoji"/>
-          <w:b/>
-          <w:bCs/>
-          <w:sz w:val="36"/>
-          <w:szCs w:val="36"/>
-        </w:rPr>
-        <w:t>📌</w:t>
-      </w:r>
-    </w:p>
-    <w:p>
-      <w:pPr>
-        <w:pStyle w:val="Normal"/>
-        <w:rPr>
-          <w:sz w:val="24"/>
-          <w:szCs w:val="24"/>
-        </w:rPr>
+        <w:t xml:space="preserve"> 📌</w:t>
+      </w:r>
+    </w:p>
+    <w:p>
+      <w:pPr>
+        <w:pStyle w:val="Normal"/>
+        <w:rPr/>
       </w:pPr>
       <w:r>
         <w:rPr>
           <w:rStyle w:val="Style18"/>
+          <w:rFonts w:ascii="Georgia" w:hAnsi="Georgia"/>
           <w:sz w:val="32"/>
           <w:szCs w:val="32"/>
         </w:rPr>
@@ -797,6 +720,7 @@
       </w:r>
       <w:r>
         <w:rPr>
+          <w:rFonts w:ascii="Georgia" w:hAnsi="Georgia"/>
           <w:b/>
           <w:bCs/>
           <w:i/>
@@ -809,7 +733,7 @@
       <w:r>
         <w:rPr>
           <w:rStyle w:val="Style19"/>
-          <w:rFonts w:ascii="Calibri" w:hAnsi="Calibri" w:asciiTheme="minorHAnsi" w:hAnsiTheme="minorHAnsi"/>
+          <w:rFonts w:ascii="Georgia" w:hAnsi="Georgia"/>
           <w:b/>
           <w:bCs/>
           <w:i/>
@@ -828,10 +752,14 @@
         <w:bidi w:val="0"/>
         <w:spacing w:lineRule="auto" w:line="240" w:before="0" w:after="160"/>
         <w:jc w:val="start"/>
-        <w:rPr/>
-      </w:pPr>
-      <w:r>
-        <w:rPr/>
+        <w:rPr>
+          <w:rFonts w:ascii="Georgia" w:hAnsi="Georgia"/>
+        </w:rPr>
+      </w:pPr>
+      <w:r>
+        <w:rPr>
+          <w:rFonts w:ascii="Georgia" w:hAnsi="Georgia"/>
+        </w:rPr>
       </w:r>
     </w:p>
     <w:sectPr>

</xml_diff>